<commit_message>
Prueba 2 (word con keys)
</commit_message>
<xml_diff>
--- a/Transfer_Answers/Inputs/Templates/Checklist etico Profesores Guías v3 1.docx
+++ b/Transfer_Answers/Inputs/Templates/Checklist etico Profesores Guías v3 1.docx
@@ -1941,7 +1941,6 @@
       <w:pPr>
         <w:pStyle w:val="NormalWeb"/>
         <w:spacing w:before="0" w:beforeAutospacing="0" w:after="120" w:afterAutospacing="0"/>
-        <w:jc w:val="both"/>
         <w:rPr>
           <w:rFonts w:asciiTheme="minorHAnsi" w:hAnsiTheme="minorHAnsi"/>
           <w:color w:val="000000"/>
@@ -1952,37 +1951,35 @@
           <w:rFonts w:asciiTheme="minorHAnsi" w:hAnsiTheme="minorHAnsi"/>
           <w:color w:val="000000"/>
         </w:rPr>
-        <w:t xml:space="preserve">En Concepción, </w:t>
-      </w:r>
-      <w:proofErr w:type="spellStart"/>
+        <w:t>En Concepción, a</w:t>
+      </w:r>
       <w:r>
         <w:rPr>
           <w:rFonts w:asciiTheme="minorHAnsi" w:hAnsiTheme="minorHAnsi"/>
           <w:color w:val="000000"/>
         </w:rPr>
-        <w:t>a__</w:t>
+        <w:t xml:space="preserve"> {{fecha}}</w:t>
       </w:r>
       <w:r>
         <w:rPr>
           <w:rFonts w:asciiTheme="minorHAnsi" w:hAnsiTheme="minorHAnsi"/>
           <w:color w:val="000000"/>
         </w:rPr>
-        <w:t>___</w:t>
+        <w:t>,</w:t>
       </w:r>
       <w:r>
         <w:rPr>
           <w:rFonts w:asciiTheme="minorHAnsi" w:hAnsiTheme="minorHAnsi"/>
           <w:color w:val="000000"/>
         </w:rPr>
-        <w:t>_de___________de</w:t>
-      </w:r>
-      <w:proofErr w:type="spellEnd"/>
+        <w:t xml:space="preserve"> </w:t>
+      </w:r>
       <w:r>
         <w:rPr>
           <w:rFonts w:asciiTheme="minorHAnsi" w:hAnsiTheme="minorHAnsi"/>
           <w:color w:val="000000"/>
         </w:rPr>
-        <w:t>________,</w:t>
+        <w:t>yo,</w:t>
       </w:r>
       <w:r>
         <w:rPr>
@@ -1994,109 +1991,160 @@
       <w:r>
         <w:rPr>
           <w:rFonts w:asciiTheme="minorHAnsi" w:hAnsiTheme="minorHAnsi"/>
+          <w:b/>
+          <w:bCs/>
           <w:color w:val="000000"/>
         </w:rPr>
-        <w:t>yo,</w:t>
+        <w:t>{{nombre}</w:t>
+      </w:r>
+      <w:proofErr w:type="gramStart"/>
+      <w:r>
+        <w:rPr>
+          <w:rFonts w:asciiTheme="minorHAnsi" w:hAnsiTheme="minorHAnsi"/>
+          <w:b/>
+          <w:bCs/>
+          <w:color w:val="000000"/>
+        </w:rPr>
+        <w:t>}</w:t>
       </w:r>
       <w:r>
         <w:rPr>
           <w:rFonts w:asciiTheme="minorHAnsi" w:hAnsiTheme="minorHAnsi"/>
           <w:color w:val="000000"/>
         </w:rPr>
-        <w:t>______________________________ _____________________</w:t>
+        <w:t xml:space="preserve"> </w:t>
       </w:r>
       <w:r>
         <w:rPr>
           <w:rFonts w:asciiTheme="minorHAnsi" w:hAnsiTheme="minorHAnsi"/>
           <w:color w:val="000000"/>
         </w:rPr>
-        <w:t xml:space="preserve">_________, RUT </w:t>
-      </w:r>
-      <w:proofErr w:type="spellStart"/>
+        <w:t>,</w:t>
+      </w:r>
+      <w:proofErr w:type="gramEnd"/>
       <w:r>
         <w:rPr>
           <w:rFonts w:asciiTheme="minorHAnsi" w:hAnsiTheme="minorHAnsi"/>
           <w:color w:val="000000"/>
         </w:rPr>
-        <w:t>N°</w:t>
-      </w:r>
-      <w:proofErr w:type="spellEnd"/>
+        <w:t xml:space="preserve"> RUT </w:t>
+      </w:r>
+      <w:proofErr w:type="spellStart"/>
       <w:r>
         <w:rPr>
           <w:rFonts w:asciiTheme="minorHAnsi" w:hAnsiTheme="minorHAnsi"/>
           <w:color w:val="000000"/>
         </w:rPr>
-        <w:t xml:space="preserve"> ____________________, en calidad de Investigador(a) Responsable de </w:t>
-      </w:r>
+        <w:t>N°</w:t>
+      </w:r>
+      <w:proofErr w:type="spellEnd"/>
       <w:r>
         <w:rPr>
           <w:rFonts w:asciiTheme="minorHAnsi" w:hAnsiTheme="minorHAnsi"/>
           <w:color w:val="000000"/>
         </w:rPr>
-        <w:t xml:space="preserve">esta </w:t>
+        <w:t xml:space="preserve"> </w:t>
+      </w:r>
+      <w:r>
+        <w:rPr>
+          <w:rFonts w:asciiTheme="minorHAnsi" w:hAnsiTheme="minorHAnsi"/>
+          <w:b/>
+          <w:bCs/>
+          <w:color w:val="000000"/>
+        </w:rPr>
+        <w:t>{{</w:t>
+      </w:r>
+      <w:proofErr w:type="spellStart"/>
+      <w:r>
+        <w:rPr>
+          <w:rFonts w:asciiTheme="minorHAnsi" w:hAnsiTheme="minorHAnsi"/>
+          <w:b/>
+          <w:bCs/>
+          <w:color w:val="000000"/>
+        </w:rPr>
+        <w:t>rut</w:t>
+      </w:r>
+      <w:proofErr w:type="spellEnd"/>
+      <w:r>
+        <w:rPr>
+          <w:rFonts w:asciiTheme="minorHAnsi" w:hAnsiTheme="minorHAnsi"/>
+          <w:b/>
+          <w:bCs/>
+          <w:color w:val="000000"/>
+        </w:rPr>
+        <w:t>}}</w:t>
       </w:r>
       <w:r>
         <w:rPr>
           <w:rFonts w:asciiTheme="minorHAnsi" w:hAnsiTheme="minorHAnsi"/>
           <w:color w:val="000000"/>
         </w:rPr>
-        <w:t>propuesta de investigación</w:t>
+        <w:t xml:space="preserve"> en calidad de Investigador(a) Responsable de </w:t>
       </w:r>
       <w:r>
         <w:rPr>
           <w:rFonts w:asciiTheme="minorHAnsi" w:hAnsiTheme="minorHAnsi"/>
           <w:color w:val="000000"/>
         </w:rPr>
-        <w:t xml:space="preserve"> </w:t>
+        <w:t xml:space="preserve">esta </w:t>
       </w:r>
       <w:r>
         <w:rPr>
           <w:rFonts w:asciiTheme="minorHAnsi" w:hAnsiTheme="minorHAnsi"/>
           <w:color w:val="000000"/>
         </w:rPr>
-        <w:t xml:space="preserve"> mediante la firma de este documento </w:t>
+        <w:t xml:space="preserve">propuesta de </w:t>
       </w:r>
       <w:r>
         <w:rPr>
           <w:rFonts w:asciiTheme="minorHAnsi" w:hAnsiTheme="minorHAnsi"/>
           <w:color w:val="000000"/>
         </w:rPr>
-        <w:t>_______________________ (solicito o no solicito)</w:t>
+        <w:t>investigación</w:t>
       </w:r>
       <w:r>
         <w:rPr>
           <w:rFonts w:asciiTheme="minorHAnsi" w:hAnsiTheme="minorHAnsi"/>
           <w:color w:val="000000"/>
         </w:rPr>
-        <w:t>,</w:t>
+        <w:t xml:space="preserve"> </w:t>
       </w:r>
       <w:r>
         <w:rPr>
           <w:rFonts w:asciiTheme="minorHAnsi" w:hAnsiTheme="minorHAnsi"/>
           <w:color w:val="000000"/>
         </w:rPr>
-        <w:t xml:space="preserve"> </w:t>
+        <w:t>mediante</w:t>
       </w:r>
       <w:r>
         <w:rPr>
           <w:rFonts w:asciiTheme="minorHAnsi" w:hAnsiTheme="minorHAnsi"/>
           <w:color w:val="000000"/>
         </w:rPr>
-        <w:t>que el</w:t>
+        <w:t xml:space="preserve"> la firma de este documento </w:t>
+      </w:r>
+      <w:r>
+        <w:rPr>
+          <w:rFonts w:asciiTheme="minorHAnsi" w:hAnsiTheme="minorHAnsi"/>
+          <w:b/>
+          <w:bCs/>
+          <w:color w:val="000000"/>
+        </w:rPr>
+        <w:t>{{solicito}}</w:t>
       </w:r>
       <w:r>
         <w:rPr>
           <w:rFonts w:asciiTheme="minorHAnsi" w:hAnsiTheme="minorHAnsi"/>
           <w:color w:val="000000"/>
         </w:rPr>
-        <w:t xml:space="preserve"> </w:t>
+        <w:t xml:space="preserve"> (solicito o no solicito)</w:t>
       </w:r>
       <w:r>
         <w:rPr>
           <w:rFonts w:asciiTheme="minorHAnsi" w:hAnsiTheme="minorHAnsi"/>
           <w:color w:val="000000"/>
         </w:rPr>
-        <w:t>proyecto</w:t>
+        <w:t>,</w:t>
       </w:r>
       <w:r>
         <w:rPr>
@@ -2110,7 +2158,7 @@
           <w:rFonts w:asciiTheme="minorHAnsi" w:hAnsiTheme="minorHAnsi"/>
           <w:color w:val="000000"/>
         </w:rPr>
-        <w:t>sea</w:t>
+        <w:t>que el</w:t>
       </w:r>
       <w:r>
         <w:rPr>
@@ -2118,6 +2166,27 @@
           <w:color w:val="000000"/>
         </w:rPr>
         <w:t xml:space="preserve"> </w:t>
+      </w:r>
+      <w:r>
+        <w:rPr>
+          <w:rFonts w:asciiTheme="minorHAnsi" w:hAnsiTheme="minorHAnsi"/>
+          <w:color w:val="000000"/>
+        </w:rPr>
+        <w:t>proyecto</w:t>
+      </w:r>
+      <w:r>
+        <w:rPr>
+          <w:rFonts w:asciiTheme="minorHAnsi" w:hAnsiTheme="minorHAnsi"/>
+          <w:color w:val="000000"/>
+        </w:rPr>
+        <w:t xml:space="preserve"> </w:t>
+      </w:r>
+      <w:r>
+        <w:rPr>
+          <w:rFonts w:asciiTheme="minorHAnsi" w:hAnsiTheme="minorHAnsi"/>
+          <w:color w:val="000000"/>
+        </w:rPr>
+        <w:t>sea</w:t>
       </w:r>
       <w:r>
         <w:rPr>

</xml_diff>